<commit_message>
questions on inner join
</commit_message>
<xml_diff>
--- a/QUERY.docx
+++ b/QUERY.docx
@@ -114,21 +114,7 @@
         <w:rPr>
           <w:lang w:val="en-US"/>
         </w:rPr>
-        <w:t>select count(*</w:t>
-      </w:r>
-      <w:proofErr w:type="gramStart"/>
-      <w:r>
-        <w:rPr>
-          <w:lang w:val="en-US"/>
-        </w:rPr>
-        <w:t>),avg</w:t>
-      </w:r>
-      <w:proofErr w:type="gramEnd"/>
-      <w:r>
-        <w:rPr>
-          <w:lang w:val="en-US"/>
-        </w:rPr>
-        <w:t>(</w:t>
+        <w:t>select count(*),avg(</w:t>
       </w:r>
       <w:proofErr w:type="spellStart"/>
       <w:r>
@@ -377,21 +363,7 @@
         <w:rPr>
           <w:lang w:val="en-US"/>
         </w:rPr>
-        <w:t>select count(*</w:t>
-      </w:r>
-      <w:proofErr w:type="gramStart"/>
-      <w:r>
-        <w:rPr>
-          <w:lang w:val="en-US"/>
-        </w:rPr>
-        <w:t>),max</w:t>
-      </w:r>
-      <w:proofErr w:type="gramEnd"/>
-      <w:r>
-        <w:rPr>
-          <w:lang w:val="en-US"/>
-        </w:rPr>
-        <w:t>(</w:t>
+        <w:t>select count(*),max(</w:t>
       </w:r>
       <w:proofErr w:type="spellStart"/>
       <w:r>
@@ -752,7 +724,6 @@
         <w:t xml:space="preserve">select </w:t>
       </w:r>
       <w:proofErr w:type="spellStart"/>
-      <w:proofErr w:type="gramStart"/>
       <w:r>
         <w:rPr>
           <w:lang w:val="en-US"/>
@@ -760,7 +731,6 @@
         <w:t>deptno,count</w:t>
       </w:r>
       <w:proofErr w:type="spellEnd"/>
-      <w:proofErr w:type="gramEnd"/>
       <w:r>
         <w:rPr>
           <w:lang w:val="en-US"/>
@@ -829,16 +799,8 @@
         <w:rPr>
           <w:lang w:val="en-US"/>
         </w:rPr>
-        <w:t xml:space="preserve">having </w:t>
-      </w:r>
-      <w:proofErr w:type="gramStart"/>
-      <w:r>
-        <w:rPr>
-          <w:lang w:val="en-US"/>
-        </w:rPr>
-        <w:t>count(</w:t>
-      </w:r>
-      <w:proofErr w:type="gramEnd"/>
+        <w:t>having count(</w:t>
+      </w:r>
       <w:r>
         <w:rPr>
           <w:lang w:val="en-US"/>
@@ -927,7 +889,6 @@
         <w:t xml:space="preserve">select </w:t>
       </w:r>
       <w:proofErr w:type="spellStart"/>
-      <w:proofErr w:type="gramStart"/>
       <w:r>
         <w:rPr>
           <w:lang w:val="en-US"/>
@@ -935,7 +896,6 @@
         <w:t>deptno,sum</w:t>
       </w:r>
       <w:proofErr w:type="spellEnd"/>
-      <w:proofErr w:type="gramEnd"/>
       <w:r>
         <w:rPr>
           <w:lang w:val="en-US"/>
@@ -990,16 +950,8 @@
         <w:rPr>
           <w:lang w:val="en-US"/>
         </w:rPr>
-        <w:t xml:space="preserve">having </w:t>
-      </w:r>
-      <w:proofErr w:type="gramStart"/>
-      <w:r>
-        <w:rPr>
-          <w:lang w:val="en-US"/>
-        </w:rPr>
-        <w:t>count(</w:t>
-      </w:r>
-      <w:proofErr w:type="gramEnd"/>
+        <w:t>having count(</w:t>
+      </w:r>
       <w:r>
         <w:rPr>
           <w:lang w:val="en-US"/>
@@ -1085,30 +1037,8 @@
         <w:rPr>
           <w:lang w:val="en-US"/>
         </w:rPr>
-        <w:t xml:space="preserve">Select </w:t>
-      </w:r>
-      <w:proofErr w:type="gramStart"/>
-      <w:r>
-        <w:rPr>
-          <w:lang w:val="en-US"/>
-        </w:rPr>
-        <w:t>count(</w:t>
-      </w:r>
-      <w:proofErr w:type="gramEnd"/>
-      <w:r>
-        <w:rPr>
-          <w:lang w:val="en-US"/>
-        </w:rPr>
-        <w:t>*</w:t>
-      </w:r>
-      <w:proofErr w:type="gramStart"/>
-      <w:r>
-        <w:rPr>
-          <w:lang w:val="en-US"/>
-        </w:rPr>
-        <w:t>),job</w:t>
-      </w:r>
-      <w:proofErr w:type="gramEnd"/>
+        <w:t>Select count(*),job</w:t>
+      </w:r>
     </w:p>
     <w:p>
       <w:pPr>
@@ -1262,7 +1192,6 @@
         <w:t xml:space="preserve">Select </w:t>
       </w:r>
       <w:proofErr w:type="spellStart"/>
-      <w:proofErr w:type="gramStart"/>
       <w:r>
         <w:rPr>
           <w:lang w:val="en-US"/>
@@ -1270,7 +1199,6 @@
         <w:t>deptno,count</w:t>
       </w:r>
       <w:proofErr w:type="spellEnd"/>
-      <w:proofErr w:type="gramEnd"/>
       <w:r>
         <w:rPr>
           <w:lang w:val="en-US"/>
@@ -1339,21 +1267,7 @@
         <w:rPr>
           <w:lang w:val="en-US"/>
         </w:rPr>
-        <w:t xml:space="preserve">Having </w:t>
-      </w:r>
-      <w:proofErr w:type="gramStart"/>
-      <w:r>
-        <w:rPr>
-          <w:lang w:val="en-US"/>
-        </w:rPr>
-        <w:t>count(*)=</w:t>
-      </w:r>
-      <w:proofErr w:type="gramEnd"/>
-      <w:r>
-        <w:rPr>
-          <w:lang w:val="en-US"/>
-        </w:rPr>
-        <w:t>2</w:t>
+        <w:t>Having count(*)=2</w:t>
       </w:r>
       <w:r>
         <w:rPr>
@@ -1429,7 +1343,6 @@
         <w:t xml:space="preserve">Select </w:t>
       </w:r>
       <w:proofErr w:type="spellStart"/>
-      <w:proofErr w:type="gramStart"/>
       <w:r>
         <w:rPr>
           <w:lang w:val="en-US"/>
@@ -1437,7 +1350,6 @@
         <w:t>job,max</w:t>
       </w:r>
       <w:proofErr w:type="spellEnd"/>
-      <w:proofErr w:type="gramEnd"/>
       <w:r>
         <w:rPr>
           <w:lang w:val="en-US"/>
@@ -1615,16 +1527,8 @@
         <w:rPr>
           <w:lang w:val="en-US"/>
         </w:rPr>
-        <w:t xml:space="preserve"> having </w:t>
-      </w:r>
-      <w:proofErr w:type="gramStart"/>
-      <w:r>
-        <w:rPr>
-          <w:lang w:val="en-US"/>
-        </w:rPr>
-        <w:t>count(</w:t>
-      </w:r>
-      <w:proofErr w:type="gramEnd"/>
+        <w:t xml:space="preserve"> having count(</w:t>
+      </w:r>
       <w:r>
         <w:rPr>
           <w:lang w:val="en-US"/>
@@ -1752,16 +1656,8 @@
         <w:rPr>
           <w:lang w:val="en-US"/>
         </w:rPr>
-        <w:t xml:space="preserve"> having </w:t>
-      </w:r>
-      <w:proofErr w:type="gramStart"/>
-      <w:r>
-        <w:rPr>
-          <w:lang w:val="en-US"/>
-        </w:rPr>
-        <w:t>count(</w:t>
-      </w:r>
-      <w:proofErr w:type="gramEnd"/>
+        <w:t xml:space="preserve"> having count(</w:t>
+      </w:r>
       <w:r>
         <w:rPr>
           <w:lang w:val="en-US"/>
@@ -2082,16 +1978,8 @@
         <w:rPr>
           <w:lang w:val="en-US"/>
         </w:rPr>
-        <w:t xml:space="preserve">Having </w:t>
-      </w:r>
-      <w:proofErr w:type="gramStart"/>
-      <w:r>
-        <w:rPr>
-          <w:lang w:val="en-US"/>
-        </w:rPr>
-        <w:t>count(</w:t>
-      </w:r>
-      <w:proofErr w:type="gramEnd"/>
+        <w:t>Having count(</w:t>
+      </w:r>
       <w:r>
         <w:rPr>
           <w:lang w:val="en-US"/>
@@ -2179,19 +2067,11 @@
         <w:t>sal</w:t>
       </w:r>
       <w:proofErr w:type="spellEnd"/>
-      <w:proofErr w:type="gramStart"/>
-      <w:r>
-        <w:rPr>
-          <w:lang w:val="en-US"/>
-        </w:rPr>
-        <w:t>),max</w:t>
-      </w:r>
-      <w:proofErr w:type="gramEnd"/>
-      <w:r>
-        <w:rPr>
-          <w:lang w:val="en-US"/>
-        </w:rPr>
-        <w:t>(</w:t>
+      <w:r>
+        <w:rPr>
+          <w:lang w:val="en-US"/>
+        </w:rPr>
+        <w:t>),max(</w:t>
       </w:r>
       <w:proofErr w:type="spellStart"/>
       <w:r>
@@ -2439,19 +2319,11 @@
         <w:t>sal</w:t>
       </w:r>
       <w:proofErr w:type="spellEnd"/>
-      <w:proofErr w:type="gramStart"/>
-      <w:r>
-        <w:rPr>
-          <w:lang w:val="en-US"/>
-        </w:rPr>
-        <w:t>&gt;(</w:t>
-      </w:r>
-      <w:proofErr w:type="gramEnd"/>
-      <w:r>
-        <w:rPr>
-          <w:lang w:val="en-US"/>
-        </w:rPr>
-        <w:t xml:space="preserve">select </w:t>
+      <w:r>
+        <w:rPr>
+          <w:lang w:val="en-US"/>
+        </w:rPr>
+        <w:t xml:space="preserve">&gt;(select </w:t>
       </w:r>
       <w:proofErr w:type="spellStart"/>
       <w:r>
@@ -2503,19 +2375,11 @@
         <w:t>deptno</w:t>
       </w:r>
       <w:proofErr w:type="spellEnd"/>
-      <w:proofErr w:type="gramStart"/>
-      <w:r>
-        <w:rPr>
-          <w:lang w:val="en-US"/>
-        </w:rPr>
-        <w:t>=(</w:t>
-      </w:r>
-      <w:proofErr w:type="gramEnd"/>
-      <w:r>
-        <w:rPr>
-          <w:lang w:val="en-US"/>
-        </w:rPr>
-        <w:t xml:space="preserve">select </w:t>
+      <w:r>
+        <w:rPr>
+          <w:lang w:val="en-US"/>
+        </w:rPr>
+        <w:t xml:space="preserve">=(select </w:t>
       </w:r>
       <w:proofErr w:type="spellStart"/>
       <w:r>
@@ -2645,19 +2509,11 @@
         <w:t>deptno</w:t>
       </w:r>
       <w:proofErr w:type="spellEnd"/>
-      <w:proofErr w:type="gramStart"/>
-      <w:r>
-        <w:rPr>
-          <w:lang w:val="en-US"/>
-        </w:rPr>
-        <w:t>=(</w:t>
-      </w:r>
-      <w:proofErr w:type="gramEnd"/>
-      <w:r>
-        <w:rPr>
-          <w:lang w:val="en-US"/>
-        </w:rPr>
-        <w:t xml:space="preserve">select </w:t>
+      <w:r>
+        <w:rPr>
+          <w:lang w:val="en-US"/>
+        </w:rPr>
+        <w:t xml:space="preserve">=(select </w:t>
       </w:r>
       <w:proofErr w:type="spellStart"/>
       <w:r>
@@ -2786,19 +2642,11 @@
         <w:t>sal</w:t>
       </w:r>
       <w:proofErr w:type="spellEnd"/>
-      <w:proofErr w:type="gramStart"/>
-      <w:r>
-        <w:rPr>
-          <w:lang w:val="en-US"/>
-        </w:rPr>
-        <w:t>&gt;(</w:t>
-      </w:r>
-      <w:proofErr w:type="gramEnd"/>
-      <w:r>
-        <w:rPr>
-          <w:lang w:val="en-US"/>
-        </w:rPr>
-        <w:t xml:space="preserve">select </w:t>
+      <w:r>
+        <w:rPr>
+          <w:lang w:val="en-US"/>
+        </w:rPr>
+        <w:t xml:space="preserve">&gt;(select </w:t>
       </w:r>
       <w:proofErr w:type="spellStart"/>
       <w:r>
@@ -3220,19 +3068,11 @@
         <w:t>hiredate</w:t>
       </w:r>
       <w:proofErr w:type="spellEnd"/>
-      <w:proofErr w:type="gramStart"/>
-      <w:r>
-        <w:rPr>
-          <w:lang w:val="en-US"/>
-        </w:rPr>
-        <w:t>&lt;(</w:t>
-      </w:r>
-      <w:proofErr w:type="gramEnd"/>
-      <w:r>
-        <w:rPr>
-          <w:lang w:val="en-US"/>
-        </w:rPr>
-        <w:t xml:space="preserve">select </w:t>
+      <w:r>
+        <w:rPr>
+          <w:lang w:val="en-US"/>
+        </w:rPr>
+        <w:t xml:space="preserve">&lt;(select </w:t>
       </w:r>
       <w:proofErr w:type="spellStart"/>
       <w:r>
@@ -3889,21 +3729,7 @@
         <w:rPr>
           <w:lang w:val="en-US"/>
         </w:rPr>
-        <w:t xml:space="preserve"> from emp </w:t>
-      </w:r>
-      <w:proofErr w:type="gramStart"/>
-      <w:r>
-        <w:rPr>
-          <w:lang w:val="en-US"/>
-        </w:rPr>
-        <w:t>where  comm</w:t>
-      </w:r>
-      <w:proofErr w:type="gramEnd"/>
-      <w:r>
-        <w:rPr>
-          <w:lang w:val="en-US"/>
-        </w:rPr>
-        <w:t xml:space="preserve"> is not null and </w:t>
+        <w:t xml:space="preserve"> from emp where  comm is not null and </w:t>
       </w:r>
     </w:p>
     <w:p>
@@ -4111,19 +3937,11 @@
         <w:t>sal</w:t>
       </w:r>
       <w:proofErr w:type="spellEnd"/>
-      <w:proofErr w:type="gramStart"/>
-      <w:r>
-        <w:rPr>
-          <w:lang w:val="en-US"/>
-        </w:rPr>
-        <w:t>&lt;(</w:t>
-      </w:r>
-      <w:proofErr w:type="gramEnd"/>
-      <w:r>
-        <w:rPr>
-          <w:lang w:val="en-US"/>
-        </w:rPr>
-        <w:t>select max(</w:t>
+      <w:r>
+        <w:rPr>
+          <w:lang w:val="en-US"/>
+        </w:rPr>
+        <w:t>&lt;(select max(</w:t>
       </w:r>
       <w:proofErr w:type="spellStart"/>
       <w:r>
@@ -4161,19 +3979,11 @@
         <w:t>sal</w:t>
       </w:r>
       <w:proofErr w:type="spellEnd"/>
-      <w:proofErr w:type="gramStart"/>
-      <w:r>
-        <w:rPr>
-          <w:lang w:val="en-US"/>
-        </w:rPr>
-        <w:t>&lt;(</w:t>
-      </w:r>
-      <w:proofErr w:type="gramEnd"/>
-      <w:r>
-        <w:rPr>
-          <w:lang w:val="en-US"/>
-        </w:rPr>
-        <w:t>select max(</w:t>
+      <w:r>
+        <w:rPr>
+          <w:lang w:val="en-US"/>
+        </w:rPr>
+        <w:t>&lt;(select max(</w:t>
       </w:r>
       <w:proofErr w:type="spellStart"/>
       <w:r>
@@ -4211,19 +4021,11 @@
         <w:t>sal</w:t>
       </w:r>
       <w:proofErr w:type="spellEnd"/>
-      <w:proofErr w:type="gramStart"/>
-      <w:r>
-        <w:rPr>
-          <w:lang w:val="en-US"/>
-        </w:rPr>
-        <w:t>&lt;(</w:t>
-      </w:r>
-      <w:proofErr w:type="gramEnd"/>
-      <w:r>
-        <w:rPr>
-          <w:lang w:val="en-US"/>
-        </w:rPr>
-        <w:t>select max(</w:t>
+      <w:r>
+        <w:rPr>
+          <w:lang w:val="en-US"/>
+        </w:rPr>
+        <w:t>&lt;(select max(</w:t>
       </w:r>
       <w:proofErr w:type="spellStart"/>
       <w:r>
@@ -4261,19 +4063,11 @@
         <w:t>sal</w:t>
       </w:r>
       <w:proofErr w:type="spellEnd"/>
-      <w:proofErr w:type="gramStart"/>
-      <w:r>
-        <w:rPr>
-          <w:lang w:val="en-US"/>
-        </w:rPr>
-        <w:t>&lt;(</w:t>
-      </w:r>
-      <w:proofErr w:type="gramEnd"/>
-      <w:r>
-        <w:rPr>
-          <w:lang w:val="en-US"/>
-        </w:rPr>
-        <w:t>select max(</w:t>
+      <w:r>
+        <w:rPr>
+          <w:lang w:val="en-US"/>
+        </w:rPr>
+        <w:t>&lt;(select max(</w:t>
       </w:r>
       <w:proofErr w:type="spellStart"/>
       <w:r>
@@ -4311,19 +4105,11 @@
         <w:t>sal</w:t>
       </w:r>
       <w:proofErr w:type="spellEnd"/>
-      <w:proofErr w:type="gramStart"/>
-      <w:r>
-        <w:rPr>
-          <w:lang w:val="en-US"/>
-        </w:rPr>
-        <w:t>&lt;(</w:t>
-      </w:r>
-      <w:proofErr w:type="gramEnd"/>
-      <w:r>
-        <w:rPr>
-          <w:lang w:val="en-US"/>
-        </w:rPr>
-        <w:t>select max(</w:t>
+      <w:r>
+        <w:rPr>
+          <w:lang w:val="en-US"/>
+        </w:rPr>
+        <w:t>&lt;(select max(</w:t>
       </w:r>
       <w:proofErr w:type="spellStart"/>
       <w:r>
@@ -4535,7 +4321,6 @@
         <w:t xml:space="preserve">Select </w:t>
       </w:r>
       <w:proofErr w:type="spellStart"/>
-      <w:proofErr w:type="gramStart"/>
       <w:r>
         <w:rPr>
           <w:lang w:val="en-US"/>
@@ -4543,7 +4328,6 @@
         <w:t>dname,loc</w:t>
       </w:r>
       <w:proofErr w:type="spellEnd"/>
-      <w:proofErr w:type="gramEnd"/>
       <w:r>
         <w:rPr>
           <w:lang w:val="en-US"/>
@@ -4642,33 +4426,11 @@
         <w:t>sal</w:t>
       </w:r>
       <w:proofErr w:type="spellEnd"/>
-      <w:proofErr w:type="gramStart"/>
-      <w:r>
-        <w:rPr>
-          <w:lang w:val="en-US"/>
-        </w:rPr>
-        <w:t>&lt;(</w:t>
-      </w:r>
-      <w:proofErr w:type="gramEnd"/>
-      <w:r>
-        <w:rPr>
-          <w:lang w:val="en-US"/>
-        </w:rPr>
-        <w:t xml:space="preserve">select </w:t>
-      </w:r>
-      <w:proofErr w:type="gramStart"/>
-      <w:r>
-        <w:rPr>
-          <w:lang w:val="en-US"/>
-        </w:rPr>
-        <w:t>max(</w:t>
-      </w:r>
-      <w:proofErr w:type="gramEnd"/>
-      <w:r>
-        <w:rPr>
-          <w:lang w:val="en-US"/>
-        </w:rPr>
-        <w:t>Sal) from emp</w:t>
+      <w:r>
+        <w:rPr>
+          <w:lang w:val="en-US"/>
+        </w:rPr>
+        <w:t>&lt;(select max(Sal) from emp</w:t>
       </w:r>
     </w:p>
     <w:p>
@@ -4692,19 +4454,11 @@
         <w:t>sal</w:t>
       </w:r>
       <w:proofErr w:type="spellEnd"/>
-      <w:proofErr w:type="gramStart"/>
-      <w:r>
-        <w:rPr>
-          <w:lang w:val="en-US"/>
-        </w:rPr>
-        <w:t>&lt;(</w:t>
-      </w:r>
-      <w:proofErr w:type="gramEnd"/>
-      <w:r>
-        <w:rPr>
-          <w:lang w:val="en-US"/>
-        </w:rPr>
-        <w:t>select max(</w:t>
+      <w:r>
+        <w:rPr>
+          <w:lang w:val="en-US"/>
+        </w:rPr>
+        <w:t>&lt;(select max(</w:t>
       </w:r>
       <w:proofErr w:type="spellStart"/>
       <w:r>
@@ -4991,14 +4745,7 @@
         <w:rPr>
           <w:lang w:val="en-US"/>
         </w:rPr>
-        <w:t xml:space="preserve">) from </w:t>
-      </w:r>
-      <w:proofErr w:type="gramStart"/>
-      <w:r>
-        <w:rPr>
-          <w:lang w:val="en-US"/>
-        </w:rPr>
-        <w:t xml:space="preserve">emp </w:t>
+        <w:t xml:space="preserve">) from emp </w:t>
       </w:r>
       <w:r>
         <w:rPr>
@@ -5006,14 +4753,12 @@
         </w:rPr>
         <w:t>)</w:t>
       </w:r>
-      <w:proofErr w:type="gramEnd"/>
       <w:r>
         <w:rPr>
           <w:lang w:val="en-US"/>
         </w:rPr>
         <w:t xml:space="preserve"> </w:t>
       </w:r>
-      <w:proofErr w:type="gramStart"/>
       <w:r>
         <w:rPr>
           <w:lang w:val="en-US"/>
@@ -5032,14 +4777,12 @@
         </w:rPr>
         <w:t>)</w:t>
       </w:r>
-      <w:proofErr w:type="gramEnd"/>
       <w:r>
         <w:rPr>
           <w:lang w:val="en-US"/>
         </w:rPr>
         <w:t xml:space="preserve"> </w:t>
       </w:r>
-      <w:proofErr w:type="gramStart"/>
       <w:r>
         <w:rPr>
           <w:lang w:val="en-US"/>
@@ -5058,7 +4801,6 @@
         </w:rPr>
         <w:t>)</w:t>
       </w:r>
-      <w:proofErr w:type="gramEnd"/>
       <w:r>
         <w:rPr>
           <w:lang w:val="en-US"/>
@@ -5560,14 +5302,7 @@
         <w:rPr>
           <w:lang w:val="en-US"/>
         </w:rPr>
-        <w:t xml:space="preserve">) from </w:t>
-      </w:r>
-      <w:proofErr w:type="gramStart"/>
-      <w:r>
-        <w:rPr>
-          <w:lang w:val="en-US"/>
-        </w:rPr>
-        <w:t xml:space="preserve">emp </w:t>
+        <w:t xml:space="preserve">) from emp </w:t>
       </w:r>
       <w:r>
         <w:rPr>
@@ -5575,7 +5310,6 @@
         </w:rPr>
         <w:t>)</w:t>
       </w:r>
-      <w:proofErr w:type="gramEnd"/>
       <w:r>
         <w:rPr>
           <w:lang w:val="en-US"/>
@@ -7259,21 +6993,7 @@
         <w:rPr>
           <w:lang w:val="en-US"/>
         </w:rPr>
-        <w:t xml:space="preserve">) from </w:t>
-      </w:r>
-      <w:proofErr w:type="gramStart"/>
-      <w:r>
-        <w:rPr>
-          <w:lang w:val="en-US"/>
-        </w:rPr>
-        <w:t>emp )</w:t>
-      </w:r>
-      <w:proofErr w:type="gramEnd"/>
-      <w:r>
-        <w:rPr>
-          <w:lang w:val="en-US"/>
-        </w:rPr>
-        <w:t>)))))))));</w:t>
+        <w:t>) from emp ))))))))));</w:t>
       </w:r>
     </w:p>
     <w:p>
@@ -7490,49 +7210,21 @@
         <w:rPr>
           <w:lang w:val="en-US"/>
         </w:rPr>
-        <w:t xml:space="preserve">Select </w:t>
-      </w:r>
-      <w:proofErr w:type="gramStart"/>
-      <w:r>
-        <w:rPr>
-          <w:lang w:val="en-US"/>
-        </w:rPr>
-        <w:t>max(</w:t>
-      </w:r>
-      <w:proofErr w:type="gramEnd"/>
-      <w:r>
-        <w:rPr>
-          <w:lang w:val="en-US"/>
-        </w:rPr>
-        <w:t xml:space="preserve">Sal) from emp where </w:t>
-      </w:r>
-      <w:proofErr w:type="spellStart"/>
-      <w:r>
-        <w:rPr>
-          <w:lang w:val="en-US"/>
-        </w:rPr>
-        <w:t>sal</w:t>
-      </w:r>
-      <w:proofErr w:type="spellEnd"/>
-      <w:r>
-        <w:rPr>
-          <w:lang w:val="en-US"/>
-        </w:rPr>
-        <w:t xml:space="preserve">&lt; (select </w:t>
-      </w:r>
-      <w:proofErr w:type="gramStart"/>
-      <w:r>
-        <w:rPr>
-          <w:lang w:val="en-US"/>
-        </w:rPr>
-        <w:t>max(</w:t>
-      </w:r>
-      <w:proofErr w:type="gramEnd"/>
-      <w:r>
-        <w:rPr>
-          <w:lang w:val="en-US"/>
-        </w:rPr>
-        <w:t>Sal) from emp);</w:t>
+        <w:t xml:space="preserve">Select max(Sal) from emp where </w:t>
+      </w:r>
+      <w:proofErr w:type="spellStart"/>
+      <w:r>
+        <w:rPr>
+          <w:lang w:val="en-US"/>
+        </w:rPr>
+        <w:t>sal</w:t>
+      </w:r>
+      <w:proofErr w:type="spellEnd"/>
+      <w:r>
+        <w:rPr>
+          <w:lang w:val="en-US"/>
+        </w:rPr>
+        <w:t>&lt; (select max(Sal) from emp);</w:t>
       </w:r>
     </w:p>
     <w:p>
@@ -7598,7 +7290,6 @@
         <w:t xml:space="preserve">Select </w:t>
       </w:r>
       <w:proofErr w:type="spellStart"/>
-      <w:proofErr w:type="gramStart"/>
       <w:r>
         <w:rPr>
           <w:lang w:val="en-US"/>
@@ -7616,14 +7307,7 @@
         <w:rPr>
           <w:lang w:val="en-US"/>
         </w:rPr>
-        <w:t xml:space="preserve"> from</w:t>
-      </w:r>
-      <w:proofErr w:type="gramEnd"/>
-      <w:r>
-        <w:rPr>
-          <w:lang w:val="en-US"/>
-        </w:rPr>
-        <w:t xml:space="preserve"> emp </w:t>
+        <w:t xml:space="preserve"> from emp </w:t>
       </w:r>
     </w:p>
     <w:p>
@@ -7657,21 +7341,7 @@
         <w:rPr>
           <w:lang w:val="en-US"/>
         </w:rPr>
-        <w:t xml:space="preserve">Select </w:t>
-      </w:r>
-      <w:proofErr w:type="gramStart"/>
-      <w:r>
-        <w:rPr>
-          <w:lang w:val="en-US"/>
-        </w:rPr>
-        <w:t>max(</w:t>
-      </w:r>
-      <w:proofErr w:type="gramEnd"/>
-      <w:r>
-        <w:rPr>
-          <w:lang w:val="en-US"/>
-        </w:rPr>
-        <w:t xml:space="preserve">Sal) from emp </w:t>
+        <w:t xml:space="preserve">Select max(Sal) from emp </w:t>
       </w:r>
     </w:p>
     <w:p>
@@ -7699,21 +7369,7 @@
         <w:rPr>
           <w:lang w:val="en-US"/>
         </w:rPr>
-        <w:t xml:space="preserve">&lt; (select </w:t>
-      </w:r>
-      <w:proofErr w:type="gramStart"/>
-      <w:r>
-        <w:rPr>
-          <w:lang w:val="en-US"/>
-        </w:rPr>
-        <w:t>max(</w:t>
-      </w:r>
-      <w:proofErr w:type="gramEnd"/>
-      <w:r>
-        <w:rPr>
-          <w:lang w:val="en-US"/>
-        </w:rPr>
-        <w:t xml:space="preserve">Sal) from emp </w:t>
+        <w:t xml:space="preserve">&lt; (select max(Sal) from emp </w:t>
       </w:r>
     </w:p>
     <w:p>
@@ -7741,21 +7397,7 @@
         <w:rPr>
           <w:lang w:val="en-US"/>
         </w:rPr>
-        <w:t xml:space="preserve">&lt; (select </w:t>
-      </w:r>
-      <w:proofErr w:type="gramStart"/>
-      <w:r>
-        <w:rPr>
-          <w:lang w:val="en-US"/>
-        </w:rPr>
-        <w:t>max(</w:t>
-      </w:r>
-      <w:proofErr w:type="gramEnd"/>
-      <w:r>
-        <w:rPr>
-          <w:lang w:val="en-US"/>
-        </w:rPr>
-        <w:t>Sal) from emp))</w:t>
+        <w:t>&lt; (select max(Sal) from emp))</w:t>
       </w:r>
       <w:r>
         <w:rPr>
@@ -7880,21 +7522,7 @@
         <w:rPr>
           <w:lang w:val="en-US"/>
         </w:rPr>
-        <w:t xml:space="preserve"> in (Select </w:t>
-      </w:r>
-      <w:proofErr w:type="gramStart"/>
-      <w:r>
-        <w:rPr>
-          <w:lang w:val="en-US"/>
-        </w:rPr>
-        <w:t>max(</w:t>
-      </w:r>
-      <w:proofErr w:type="gramEnd"/>
-      <w:r>
-        <w:rPr>
-          <w:lang w:val="en-US"/>
-        </w:rPr>
-        <w:t xml:space="preserve">Sal) from emp </w:t>
+        <w:t xml:space="preserve"> in (Select max(Sal) from emp </w:t>
       </w:r>
     </w:p>
     <w:p>
@@ -7922,21 +7550,7 @@
         <w:rPr>
           <w:lang w:val="en-US"/>
         </w:rPr>
-        <w:t xml:space="preserve">&lt; (select </w:t>
-      </w:r>
-      <w:proofErr w:type="gramStart"/>
-      <w:r>
-        <w:rPr>
-          <w:lang w:val="en-US"/>
-        </w:rPr>
-        <w:t>max(</w:t>
-      </w:r>
-      <w:proofErr w:type="gramEnd"/>
-      <w:r>
-        <w:rPr>
-          <w:lang w:val="en-US"/>
-        </w:rPr>
-        <w:t xml:space="preserve">Sal) from emp </w:t>
+        <w:t xml:space="preserve">&lt; (select max(Sal) from emp </w:t>
       </w:r>
     </w:p>
     <w:p>
@@ -7964,21 +7578,7 @@
         <w:rPr>
           <w:lang w:val="en-US"/>
         </w:rPr>
-        <w:t xml:space="preserve">&lt; (select </w:t>
-      </w:r>
-      <w:proofErr w:type="gramStart"/>
-      <w:r>
-        <w:rPr>
-          <w:lang w:val="en-US"/>
-        </w:rPr>
-        <w:t>max(</w:t>
-      </w:r>
-      <w:proofErr w:type="gramEnd"/>
-      <w:r>
-        <w:rPr>
-          <w:lang w:val="en-US"/>
-        </w:rPr>
-        <w:t xml:space="preserve">Sal) from emp </w:t>
+        <w:t xml:space="preserve">&lt; (select max(Sal) from emp </w:t>
       </w:r>
     </w:p>
     <w:p>
@@ -8006,21 +7606,7 @@
         <w:rPr>
           <w:lang w:val="en-US"/>
         </w:rPr>
-        <w:t xml:space="preserve">&lt; (select </w:t>
-      </w:r>
-      <w:proofErr w:type="gramStart"/>
-      <w:r>
-        <w:rPr>
-          <w:lang w:val="en-US"/>
-        </w:rPr>
-        <w:t>max(</w:t>
-      </w:r>
-      <w:proofErr w:type="gramEnd"/>
-      <w:r>
-        <w:rPr>
-          <w:lang w:val="en-US"/>
-        </w:rPr>
-        <w:t>Sal) from emp))));</w:t>
+        <w:t>&lt; (select max(Sal) from emp))));</w:t>
       </w:r>
     </w:p>
     <w:p>
@@ -11363,21 +10949,7 @@
         <w:rPr>
           <w:lang w:val="en-US"/>
         </w:rPr>
-        <w:t xml:space="preserve">Select </w:t>
-      </w:r>
-      <w:proofErr w:type="gramStart"/>
-      <w:r>
-        <w:rPr>
-          <w:lang w:val="en-US"/>
-        </w:rPr>
-        <w:t>count(</w:t>
-      </w:r>
-      <w:proofErr w:type="gramEnd"/>
-      <w:r>
-        <w:rPr>
-          <w:lang w:val="en-US"/>
-        </w:rPr>
-        <w:t>*) from emp</w:t>
+        <w:t>Select count(*) from emp</w:t>
       </w:r>
     </w:p>
     <w:p>
@@ -12542,21 +12114,7 @@
         <w:rPr>
           <w:lang w:val="en-US"/>
         </w:rPr>
-        <w:t xml:space="preserve">Select </w:t>
-      </w:r>
-      <w:proofErr w:type="gramStart"/>
-      <w:r>
-        <w:rPr>
-          <w:lang w:val="en-US"/>
-        </w:rPr>
-        <w:t>count(</w:t>
-      </w:r>
-      <w:proofErr w:type="gramEnd"/>
-      <w:r>
-        <w:rPr>
-          <w:lang w:val="en-US"/>
-        </w:rPr>
-        <w:t xml:space="preserve">*) from emp where </w:t>
+        <w:t xml:space="preserve">Select count(*) from emp where </w:t>
       </w:r>
       <w:proofErr w:type="spellStart"/>
       <w:r>
@@ -13238,21 +12796,7 @@
         <w:rPr>
           <w:lang w:val="en-US"/>
         </w:rPr>
-        <w:t xml:space="preserve">Select </w:t>
-      </w:r>
-      <w:proofErr w:type="gramStart"/>
-      <w:r>
-        <w:rPr>
-          <w:lang w:val="en-US"/>
-        </w:rPr>
-        <w:t>count(</w:t>
-      </w:r>
-      <w:proofErr w:type="gramEnd"/>
-      <w:r>
-        <w:rPr>
-          <w:lang w:val="en-US"/>
-        </w:rPr>
-        <w:t xml:space="preserve">*) from emp where </w:t>
+        <w:t xml:space="preserve">Select count(*) from emp where </w:t>
       </w:r>
       <w:proofErr w:type="spellStart"/>
       <w:r>
@@ -13507,6 +13051,1104 @@
           <w:lang w:val="en-US"/>
         </w:rPr>
       </w:pPr>
+      <w:r>
+        <w:rPr>
+          <w:noProof/>
+          <w:lang w:val="en-US"/>
+        </w:rPr>
+        <w:drawing>
+          <wp:inline distT="0" distB="0" distL="0" distR="0" wp14:anchorId="663414F6" wp14:editId="77150A30">
+            <wp:extent cx="2463927" cy="330217"/>
+            <wp:effectExtent l="0" t="0" r="0" b="0"/>
+            <wp:docPr id="1168314124" name="Picture 1"/>
+            <wp:cNvGraphicFramePr>
+              <a:graphicFrameLocks xmlns:a="http://schemas.openxmlformats.org/drawingml/2006/main" noChangeAspect="1"/>
+            </wp:cNvGraphicFramePr>
+            <a:graphic xmlns:a="http://schemas.openxmlformats.org/drawingml/2006/main">
+              <a:graphicData uri="http://schemas.openxmlformats.org/drawingml/2006/picture">
+                <pic:pic xmlns:pic="http://schemas.openxmlformats.org/drawingml/2006/picture">
+                  <pic:nvPicPr>
+                    <pic:cNvPr id="1168314124" name=""/>
+                    <pic:cNvPicPr/>
+                  </pic:nvPicPr>
+                  <pic:blipFill>
+                    <a:blip r:embed="rId76"/>
+                    <a:stretch>
+                      <a:fillRect/>
+                    </a:stretch>
+                  </pic:blipFill>
+                  <pic:spPr>
+                    <a:xfrm>
+                      <a:off x="0" y="0"/>
+                      <a:ext cx="2463927" cy="330217"/>
+                    </a:xfrm>
+                    <a:prstGeom prst="rect">
+                      <a:avLst/>
+                    </a:prstGeom>
+                  </pic:spPr>
+                </pic:pic>
+              </a:graphicData>
+            </a:graphic>
+          </wp:inline>
+        </w:drawing>
+      </w:r>
+    </w:p>
+    <w:p>
+      <w:pPr>
+        <w:pStyle w:val="ListParagraph"/>
+        <w:rPr>
+          <w:lang w:val="en-US"/>
+        </w:rPr>
+      </w:pPr>
+    </w:p>
+    <w:p>
+      <w:pPr>
+        <w:pStyle w:val="ListParagraph"/>
+        <w:rPr>
+          <w:b/>
+          <w:bCs/>
+        </w:rPr>
+      </w:pPr>
+      <w:r>
+        <w:rPr>
+          <w:b/>
+          <w:bCs/>
+        </w:rPr>
+        <w:t>7. WAQTD DNAME AND MGR NO FOR EMPS REPORTING TO 7839.</w:t>
+      </w:r>
+    </w:p>
+    <w:p>
+      <w:pPr>
+        <w:pStyle w:val="ListParagraph"/>
+        <w:rPr>
+          <w:lang w:val="en-US"/>
+        </w:rPr>
+      </w:pPr>
+      <w:r>
+        <w:rPr>
+          <w:lang w:val="en-US"/>
+        </w:rPr>
+        <w:t>ORACLE:</w:t>
+      </w:r>
+    </w:p>
+    <w:p>
+      <w:pPr>
+        <w:pStyle w:val="ListParagraph"/>
+        <w:rPr>
+          <w:lang w:val="en-US"/>
+        </w:rPr>
+      </w:pPr>
+      <w:r>
+        <w:rPr>
+          <w:lang w:val="en-US"/>
+        </w:rPr>
+        <w:t xml:space="preserve">Select </w:t>
+      </w:r>
+      <w:proofErr w:type="spellStart"/>
+      <w:r>
+        <w:rPr>
+          <w:lang w:val="en-US"/>
+        </w:rPr>
+        <w:t>dname,mgr</w:t>
+      </w:r>
+      <w:proofErr w:type="spellEnd"/>
+      <w:r>
+        <w:rPr>
+          <w:lang w:val="en-US"/>
+        </w:rPr>
+        <w:t xml:space="preserve"> from </w:t>
+      </w:r>
+      <w:r>
+        <w:rPr>
+          <w:lang w:val="en-US"/>
+        </w:rPr>
+        <w:t>emp e, dept d</w:t>
+      </w:r>
+    </w:p>
+    <w:p>
+      <w:pPr>
+        <w:pStyle w:val="ListParagraph"/>
+        <w:rPr>
+          <w:lang w:val="en-US"/>
+        </w:rPr>
+      </w:pPr>
+      <w:r>
+        <w:rPr>
+          <w:lang w:val="en-US"/>
+        </w:rPr>
+        <w:t xml:space="preserve">Where </w:t>
+      </w:r>
+      <w:proofErr w:type="spellStart"/>
+      <w:r>
+        <w:rPr>
+          <w:lang w:val="en-US"/>
+        </w:rPr>
+        <w:t>e.deptno</w:t>
+      </w:r>
+      <w:proofErr w:type="spellEnd"/>
+      <w:r>
+        <w:rPr>
+          <w:lang w:val="en-US"/>
+        </w:rPr>
+        <w:t>=</w:t>
+      </w:r>
+      <w:proofErr w:type="spellStart"/>
+      <w:r>
+        <w:rPr>
+          <w:lang w:val="en-US"/>
+        </w:rPr>
+        <w:t>d.deptno</w:t>
+      </w:r>
+      <w:proofErr w:type="spellEnd"/>
+      <w:r>
+        <w:rPr>
+          <w:lang w:val="en-US"/>
+        </w:rPr>
+        <w:t xml:space="preserve"> and </w:t>
+      </w:r>
+      <w:proofErr w:type="spellStart"/>
+      <w:r>
+        <w:rPr>
+          <w:lang w:val="en-US"/>
+        </w:rPr>
+        <w:t>mgr</w:t>
+      </w:r>
+      <w:proofErr w:type="spellEnd"/>
+      <w:r>
+        <w:rPr>
+          <w:lang w:val="en-US"/>
+        </w:rPr>
+        <w:t>=7839;</w:t>
+      </w:r>
+    </w:p>
+    <w:p>
+      <w:pPr>
+        <w:pStyle w:val="ListParagraph"/>
+        <w:rPr>
+          <w:lang w:val="en-US"/>
+        </w:rPr>
+      </w:pPr>
+      <w:r>
+        <w:rPr>
+          <w:lang w:val="en-US"/>
+        </w:rPr>
+        <w:t>ANSI:</w:t>
+      </w:r>
+    </w:p>
+    <w:p>
+      <w:pPr>
+        <w:pStyle w:val="ListParagraph"/>
+        <w:rPr>
+          <w:lang w:val="en-US"/>
+        </w:rPr>
+      </w:pPr>
+      <w:r>
+        <w:rPr>
+          <w:lang w:val="en-US"/>
+        </w:rPr>
+        <w:t xml:space="preserve">Select </w:t>
+      </w:r>
+      <w:proofErr w:type="spellStart"/>
+      <w:r>
+        <w:rPr>
+          <w:lang w:val="en-US"/>
+        </w:rPr>
+        <w:t>dname,mgr</w:t>
+      </w:r>
+      <w:proofErr w:type="spellEnd"/>
+      <w:r>
+        <w:rPr>
+          <w:lang w:val="en-US"/>
+        </w:rPr>
+        <w:t xml:space="preserve"> from emp e inner join dept d</w:t>
+      </w:r>
+    </w:p>
+    <w:p>
+      <w:pPr>
+        <w:pStyle w:val="ListParagraph"/>
+        <w:rPr>
+          <w:lang w:val="en-US"/>
+        </w:rPr>
+      </w:pPr>
+      <w:proofErr w:type="spellStart"/>
+      <w:r>
+        <w:rPr>
+          <w:lang w:val="en-US"/>
+        </w:rPr>
+        <w:t>on</w:t>
+      </w:r>
+      <w:r>
+        <w:rPr>
+          <w:lang w:val="en-US"/>
+        </w:rPr>
+        <w:t xml:space="preserve"> e</w:t>
+      </w:r>
+      <w:proofErr w:type="spellEnd"/>
+      <w:r>
+        <w:rPr>
+          <w:lang w:val="en-US"/>
+        </w:rPr>
+        <w:t xml:space="preserve">.deptno=d.deptno and </w:t>
+      </w:r>
+      <w:proofErr w:type="spellStart"/>
+      <w:r>
+        <w:rPr>
+          <w:lang w:val="en-US"/>
+        </w:rPr>
+        <w:t>mgr</w:t>
+      </w:r>
+      <w:proofErr w:type="spellEnd"/>
+      <w:r>
+        <w:rPr>
+          <w:lang w:val="en-US"/>
+        </w:rPr>
+        <w:t>=7839;</w:t>
+      </w:r>
+    </w:p>
+    <w:p>
+      <w:pPr>
+        <w:pStyle w:val="ListParagraph"/>
+        <w:rPr>
+          <w:b/>
+          <w:bCs/>
+        </w:rPr>
+      </w:pPr>
+      <w:r>
+        <w:rPr>
+          <w:b/>
+          <w:bCs/>
+        </w:rPr>
+        <w:t>8. WAQTD DNAME AND HIREDATE FOR EMPS HIRED AFTER 83 INTO ACCOUNTING OR RESEARCH DEPT.</w:t>
+      </w:r>
+    </w:p>
+    <w:p>
+      <w:pPr>
+        <w:pStyle w:val="ListParagraph"/>
+      </w:pPr>
+      <w:r>
+        <w:t xml:space="preserve">Select </w:t>
+      </w:r>
+      <w:proofErr w:type="spellStart"/>
+      <w:r>
+        <w:t>dname</w:t>
+      </w:r>
+      <w:proofErr w:type="spellEnd"/>
+      <w:r>
+        <w:t xml:space="preserve">, </w:t>
+      </w:r>
+      <w:proofErr w:type="spellStart"/>
+      <w:r>
+        <w:t>hiredate</w:t>
+      </w:r>
+      <w:proofErr w:type="spellEnd"/>
+      <w:r>
+        <w:t xml:space="preserve"> </w:t>
+      </w:r>
+    </w:p>
+    <w:p>
+      <w:pPr>
+        <w:pStyle w:val="ListParagraph"/>
+      </w:pPr>
+      <w:r>
+        <w:t>From emp e, dept d</w:t>
+      </w:r>
+    </w:p>
+    <w:p>
+      <w:pPr>
+        <w:pStyle w:val="ListParagraph"/>
+      </w:pPr>
+      <w:r>
+        <w:t xml:space="preserve">Where </w:t>
+      </w:r>
+      <w:proofErr w:type="spellStart"/>
+      <w:r>
+        <w:t>e.deptno</w:t>
+      </w:r>
+      <w:proofErr w:type="spellEnd"/>
+      <w:r>
+        <w:t>=</w:t>
+      </w:r>
+      <w:proofErr w:type="spellStart"/>
+      <w:r>
+        <w:t>d.deptno</w:t>
+      </w:r>
+      <w:proofErr w:type="spellEnd"/>
+      <w:r>
+        <w:t xml:space="preserve"> and </w:t>
+      </w:r>
+      <w:proofErr w:type="spellStart"/>
+      <w:r>
+        <w:t>hiredate</w:t>
+      </w:r>
+      <w:proofErr w:type="spellEnd"/>
+      <w:r>
+        <w:t xml:space="preserve"> &gt; </w:t>
+      </w:r>
+      <w:r>
+        <w:t>’01-JAN-83’</w:t>
+      </w:r>
+      <w:r>
+        <w:t xml:space="preserve"> and </w:t>
+      </w:r>
+      <w:proofErr w:type="spellStart"/>
+      <w:r>
+        <w:t>dname</w:t>
+      </w:r>
+      <w:proofErr w:type="spellEnd"/>
+      <w:r>
+        <w:t xml:space="preserve"> in (‘ACCOUNTING’,’RESEARCH’);</w:t>
+      </w:r>
+    </w:p>
+    <w:p>
+      <w:pPr>
+        <w:pStyle w:val="ListParagraph"/>
+        <w:rPr>
+          <w:b/>
+          <w:bCs/>
+          <w:lang w:val="en-US"/>
+        </w:rPr>
+      </w:pPr>
+      <w:r>
+        <w:rPr>
+          <w:b/>
+          <w:bCs/>
+          <w:lang w:val="en-US"/>
+        </w:rPr>
+        <w:t xml:space="preserve">9. </w:t>
+      </w:r>
+      <w:r>
+        <w:rPr>
+          <w:b/>
+          <w:bCs/>
+        </w:rPr>
+        <w:t>WAQTD ENAME DEPTNO AND DNAME OF THE EMPS WHO ARE GETTING COMM IN DEPT 10 OR 30.</w:t>
+      </w:r>
+    </w:p>
+    <w:p>
+      <w:pPr>
+        <w:pStyle w:val="ListParagraph"/>
+        <w:rPr>
+          <w:lang w:val="en-US"/>
+        </w:rPr>
+      </w:pPr>
+      <w:r>
+        <w:rPr>
+          <w:lang w:val="en-US"/>
+        </w:rPr>
+        <w:t xml:space="preserve">Select </w:t>
+      </w:r>
+      <w:proofErr w:type="spellStart"/>
+      <w:r>
+        <w:rPr>
+          <w:lang w:val="en-US"/>
+        </w:rPr>
+        <w:t>ename</w:t>
+      </w:r>
+      <w:proofErr w:type="spellEnd"/>
+      <w:r>
+        <w:rPr>
+          <w:lang w:val="en-US"/>
+        </w:rPr>
+        <w:t xml:space="preserve">, </w:t>
+      </w:r>
+      <w:proofErr w:type="spellStart"/>
+      <w:r>
+        <w:rPr>
+          <w:lang w:val="en-US"/>
+        </w:rPr>
+        <w:t>e.deptno</w:t>
+      </w:r>
+      <w:proofErr w:type="spellEnd"/>
+      <w:r>
+        <w:rPr>
+          <w:lang w:val="en-US"/>
+        </w:rPr>
+        <w:t xml:space="preserve">, </w:t>
+      </w:r>
+      <w:proofErr w:type="spellStart"/>
+      <w:r>
+        <w:rPr>
+          <w:lang w:val="en-US"/>
+        </w:rPr>
+        <w:t>dname</w:t>
+      </w:r>
+      <w:proofErr w:type="spellEnd"/>
+    </w:p>
+    <w:p>
+      <w:pPr>
+        <w:pStyle w:val="ListParagraph"/>
+        <w:rPr>
+          <w:lang w:val="en-US"/>
+        </w:rPr>
+      </w:pPr>
+      <w:r>
+        <w:rPr>
+          <w:lang w:val="en-US"/>
+        </w:rPr>
+        <w:t>From emp e, dept d</w:t>
+      </w:r>
+    </w:p>
+    <w:p>
+      <w:pPr>
+        <w:pStyle w:val="ListParagraph"/>
+        <w:rPr>
+          <w:lang w:val="en-US"/>
+        </w:rPr>
+      </w:pPr>
+      <w:r>
+        <w:rPr>
+          <w:lang w:val="en-US"/>
+        </w:rPr>
+        <w:t xml:space="preserve">Where </w:t>
+      </w:r>
+      <w:proofErr w:type="spellStart"/>
+      <w:r>
+        <w:rPr>
+          <w:lang w:val="en-US"/>
+        </w:rPr>
+        <w:t>e.deptno</w:t>
+      </w:r>
+      <w:proofErr w:type="spellEnd"/>
+      <w:r>
+        <w:rPr>
+          <w:lang w:val="en-US"/>
+        </w:rPr>
+        <w:t>=</w:t>
+      </w:r>
+      <w:proofErr w:type="spellStart"/>
+      <w:r>
+        <w:rPr>
+          <w:lang w:val="en-US"/>
+        </w:rPr>
+        <w:t>d.deptno</w:t>
+      </w:r>
+      <w:proofErr w:type="spellEnd"/>
+      <w:r>
+        <w:rPr>
+          <w:lang w:val="en-US"/>
+        </w:rPr>
+        <w:t xml:space="preserve"> and comm is not null and </w:t>
+      </w:r>
+      <w:proofErr w:type="spellStart"/>
+      <w:r>
+        <w:rPr>
+          <w:lang w:val="en-US"/>
+        </w:rPr>
+        <w:t>e.</w:t>
+      </w:r>
+      <w:r>
+        <w:rPr>
+          <w:lang w:val="en-US"/>
+        </w:rPr>
+        <w:t>deptno</w:t>
+      </w:r>
+      <w:proofErr w:type="spellEnd"/>
+      <w:r>
+        <w:rPr>
+          <w:lang w:val="en-US"/>
+        </w:rPr>
+        <w:t xml:space="preserve"> in (10,30);</w:t>
+      </w:r>
+    </w:p>
+    <w:p>
+      <w:pPr>
+        <w:pStyle w:val="ListParagraph"/>
+        <w:rPr>
+          <w:b/>
+          <w:bCs/>
+        </w:rPr>
+      </w:pPr>
+      <w:r>
+        <w:rPr>
+          <w:b/>
+          <w:bCs/>
+          <w:lang w:val="en-US"/>
+        </w:rPr>
+        <w:t xml:space="preserve">10. </w:t>
+      </w:r>
+      <w:r>
+        <w:rPr>
+          <w:b/>
+          <w:bCs/>
+        </w:rPr>
+        <w:t>WAQTD DETAILS FROM EMPS AND DEPT TABLE.</w:t>
+      </w:r>
+    </w:p>
+    <w:p>
+      <w:pPr>
+        <w:pStyle w:val="ListParagraph"/>
+      </w:pPr>
+      <w:r>
+        <w:t>ANSI:</w:t>
+      </w:r>
+    </w:p>
+    <w:p>
+      <w:pPr>
+        <w:pStyle w:val="ListParagraph"/>
+      </w:pPr>
+      <w:r>
+        <w:t>Select * From emp e inner join dept d</w:t>
+      </w:r>
+    </w:p>
+    <w:p>
+      <w:pPr>
+        <w:pStyle w:val="ListParagraph"/>
+      </w:pPr>
+      <w:proofErr w:type="spellStart"/>
+      <w:r>
+        <w:t>on e</w:t>
+      </w:r>
+      <w:proofErr w:type="spellEnd"/>
+      <w:r>
+        <w:t>.deptno=d.deptno;</w:t>
+      </w:r>
+    </w:p>
+    <w:p>
+      <w:pPr>
+        <w:pStyle w:val="ListParagraph"/>
+      </w:pPr>
+      <w:r>
+        <w:t>ORACLE:</w:t>
+      </w:r>
+    </w:p>
+    <w:p>
+      <w:pPr>
+        <w:pStyle w:val="ListParagraph"/>
+      </w:pPr>
+      <w:r>
+        <w:t>Select * From emp e, dept d</w:t>
+      </w:r>
+    </w:p>
+    <w:p>
+      <w:pPr>
+        <w:pStyle w:val="ListParagraph"/>
+      </w:pPr>
+      <w:r>
+        <w:lastRenderedPageBreak/>
+        <w:t xml:space="preserve">Where </w:t>
+      </w:r>
+      <w:proofErr w:type="spellStart"/>
+      <w:r>
+        <w:t>e.deptno</w:t>
+      </w:r>
+      <w:proofErr w:type="spellEnd"/>
+      <w:r>
+        <w:t>=</w:t>
+      </w:r>
+      <w:proofErr w:type="spellStart"/>
+      <w:r>
+        <w:t>d.deptno</w:t>
+      </w:r>
+      <w:proofErr w:type="spellEnd"/>
+      <w:r>
+        <w:t>;</w:t>
+      </w:r>
+    </w:p>
+    <w:p>
+      <w:pPr>
+        <w:pStyle w:val="ListParagraph"/>
+      </w:pPr>
+    </w:p>
+    <w:p>
+      <w:pPr>
+        <w:pStyle w:val="ListParagraph"/>
+      </w:pPr>
+      <w:r>
+        <w:rPr>
+          <w:b/>
+          <w:bCs/>
+        </w:rPr>
+        <w:t xml:space="preserve">11. </w:t>
+      </w:r>
+      <w:r>
+        <w:rPr>
+          <w:b/>
+          <w:bCs/>
+        </w:rPr>
+        <w:t xml:space="preserve">WAQTD DEPTNO, JOB, LOC FOR ALL THE EMPS AND THERE DEPT NAME SHOULD HAVE </w:t>
+      </w:r>
+      <w:r>
+        <w:rPr>
+          <w:b/>
+          <w:bCs/>
+        </w:rPr>
+        <w:t>CHAR 'A'.</w:t>
+      </w:r>
+    </w:p>
+    <w:p>
+      <w:pPr>
+        <w:pStyle w:val="ListParagraph"/>
+      </w:pPr>
+      <w:r>
+        <w:t xml:space="preserve">Select </w:t>
+      </w:r>
+      <w:proofErr w:type="spellStart"/>
+      <w:r>
+        <w:t>e.deptno</w:t>
+      </w:r>
+      <w:proofErr w:type="spellEnd"/>
+      <w:r>
+        <w:t>, job, loc</w:t>
+      </w:r>
+    </w:p>
+    <w:p>
+      <w:pPr>
+        <w:pStyle w:val="ListParagraph"/>
+      </w:pPr>
+      <w:r>
+        <w:t>From emp e, dept d</w:t>
+      </w:r>
+    </w:p>
+    <w:p>
+      <w:pPr>
+        <w:pStyle w:val="ListParagraph"/>
+      </w:pPr>
+      <w:r>
+        <w:t xml:space="preserve">Where </w:t>
+      </w:r>
+      <w:proofErr w:type="spellStart"/>
+      <w:r>
+        <w:t>e.deptno</w:t>
+      </w:r>
+      <w:proofErr w:type="spellEnd"/>
+      <w:r>
+        <w:t>=</w:t>
+      </w:r>
+      <w:proofErr w:type="spellStart"/>
+      <w:r>
+        <w:t>d.deptno</w:t>
+      </w:r>
+      <w:proofErr w:type="spellEnd"/>
+      <w:r>
+        <w:t xml:space="preserve"> and </w:t>
+      </w:r>
+      <w:proofErr w:type="spellStart"/>
+      <w:r>
+        <w:t>dname</w:t>
+      </w:r>
+      <w:proofErr w:type="spellEnd"/>
+      <w:r>
+        <w:t xml:space="preserve"> like ‘%A%’;</w:t>
+      </w:r>
+    </w:p>
+    <w:p>
+      <w:pPr>
+        <w:pStyle w:val="ListParagraph"/>
+        <w:rPr>
+          <w:b/>
+          <w:bCs/>
+        </w:rPr>
+      </w:pPr>
+      <w:r>
+        <w:rPr>
+          <w:b/>
+          <w:bCs/>
+          <w:lang w:val="en-US"/>
+        </w:rPr>
+        <w:t xml:space="preserve">12. </w:t>
+      </w:r>
+      <w:r>
+        <w:rPr>
+          <w:b/>
+          <w:bCs/>
+        </w:rPr>
+        <w:t>WAQTD HIREDATE, LOC, COMM, SAL, DEPTNO IF THE EMPS ARE FROM NEW YORK.</w:t>
+      </w:r>
+    </w:p>
+    <w:p>
+      <w:pPr>
+        <w:pStyle w:val="ListParagraph"/>
+        <w:rPr>
+          <w:lang w:val="en-US"/>
+        </w:rPr>
+      </w:pPr>
+      <w:r>
+        <w:rPr>
+          <w:lang w:val="en-US"/>
+        </w:rPr>
+        <w:t xml:space="preserve">Select </w:t>
+      </w:r>
+      <w:proofErr w:type="spellStart"/>
+      <w:r>
+        <w:rPr>
+          <w:lang w:val="en-US"/>
+        </w:rPr>
+        <w:t>hiredate,loc,comm,sal,e.deptno</w:t>
+      </w:r>
+      <w:proofErr w:type="spellEnd"/>
+    </w:p>
+    <w:p>
+      <w:pPr>
+        <w:pStyle w:val="ListParagraph"/>
+        <w:rPr>
+          <w:lang w:val="en-US"/>
+        </w:rPr>
+      </w:pPr>
+      <w:r>
+        <w:rPr>
+          <w:lang w:val="en-US"/>
+        </w:rPr>
+        <w:t xml:space="preserve">From emp </w:t>
+      </w:r>
+      <w:proofErr w:type="spellStart"/>
+      <w:r>
+        <w:rPr>
+          <w:lang w:val="en-US"/>
+        </w:rPr>
+        <w:t>e,dept</w:t>
+      </w:r>
+      <w:proofErr w:type="spellEnd"/>
+      <w:r>
+        <w:rPr>
+          <w:lang w:val="en-US"/>
+        </w:rPr>
+        <w:t xml:space="preserve"> d</w:t>
+      </w:r>
+    </w:p>
+    <w:p>
+      <w:pPr>
+        <w:pStyle w:val="ListParagraph"/>
+        <w:rPr>
+          <w:lang w:val="en-US"/>
+        </w:rPr>
+      </w:pPr>
+      <w:r>
+        <w:rPr>
+          <w:lang w:val="en-US"/>
+        </w:rPr>
+        <w:t xml:space="preserve">Where </w:t>
+      </w:r>
+      <w:proofErr w:type="spellStart"/>
+      <w:r>
+        <w:rPr>
+          <w:lang w:val="en-US"/>
+        </w:rPr>
+        <w:t>e.deptno</w:t>
+      </w:r>
+      <w:proofErr w:type="spellEnd"/>
+      <w:r>
+        <w:rPr>
+          <w:lang w:val="en-US"/>
+        </w:rPr>
+        <w:t>=</w:t>
+      </w:r>
+      <w:proofErr w:type="spellStart"/>
+      <w:r>
+        <w:rPr>
+          <w:lang w:val="en-US"/>
+        </w:rPr>
+        <w:t>d.deptno</w:t>
+      </w:r>
+      <w:proofErr w:type="spellEnd"/>
+      <w:r>
+        <w:rPr>
+          <w:lang w:val="en-US"/>
+        </w:rPr>
+        <w:t xml:space="preserve"> and loc = ‘NEW YORK’;</w:t>
+      </w:r>
+    </w:p>
+    <w:p>
+      <w:pPr>
+        <w:pStyle w:val="ListParagraph"/>
+        <w:rPr>
+          <w:b/>
+          <w:bCs/>
+        </w:rPr>
+      </w:pPr>
+      <w:r>
+        <w:rPr>
+          <w:b/>
+          <w:bCs/>
+          <w:lang w:val="en-US"/>
+        </w:rPr>
+        <w:t xml:space="preserve">13. </w:t>
+      </w:r>
+      <w:r>
+        <w:rPr>
+          <w:b/>
+          <w:bCs/>
+        </w:rPr>
+        <w:t>WAQTD DETAILS OF THE EMPS WHO HIRED ON 4TH MONTH OF THE YEAR TO SALES DEPT.</w:t>
+      </w:r>
+    </w:p>
+    <w:p>
+      <w:pPr>
+        <w:pStyle w:val="ListParagraph"/>
+        <w:rPr>
+          <w:lang w:val="en-US"/>
+        </w:rPr>
+      </w:pPr>
+      <w:r>
+        <w:rPr>
+          <w:lang w:val="en-US"/>
+        </w:rPr>
+        <w:t>Select * from emp e, dept d</w:t>
+      </w:r>
+    </w:p>
+    <w:p>
+      <w:pPr>
+        <w:pStyle w:val="ListParagraph"/>
+        <w:rPr>
+          <w:lang w:val="en-US"/>
+        </w:rPr>
+      </w:pPr>
+      <w:r>
+        <w:rPr>
+          <w:lang w:val="en-US"/>
+        </w:rPr>
+        <w:t xml:space="preserve">Where </w:t>
+      </w:r>
+      <w:proofErr w:type="spellStart"/>
+      <w:r>
+        <w:rPr>
+          <w:lang w:val="en-US"/>
+        </w:rPr>
+        <w:t>e.deptno</w:t>
+      </w:r>
+      <w:proofErr w:type="spellEnd"/>
+      <w:r>
+        <w:rPr>
+          <w:lang w:val="en-US"/>
+        </w:rPr>
+        <w:t>=</w:t>
+      </w:r>
+      <w:proofErr w:type="spellStart"/>
+      <w:r>
+        <w:rPr>
+          <w:lang w:val="en-US"/>
+        </w:rPr>
+        <w:t>d.deptno</w:t>
+      </w:r>
+      <w:proofErr w:type="spellEnd"/>
+      <w:r>
+        <w:rPr>
+          <w:lang w:val="en-US"/>
+        </w:rPr>
+        <w:t xml:space="preserve"> and </w:t>
+      </w:r>
+      <w:proofErr w:type="spellStart"/>
+      <w:r>
+        <w:rPr>
+          <w:lang w:val="en-US"/>
+        </w:rPr>
+        <w:t>hiredate</w:t>
+      </w:r>
+      <w:proofErr w:type="spellEnd"/>
+      <w:r>
+        <w:rPr>
+          <w:lang w:val="en-US"/>
+        </w:rPr>
+        <w:t xml:space="preserve"> like ‘%APR%’ and </w:t>
+      </w:r>
+      <w:proofErr w:type="spellStart"/>
+      <w:r>
+        <w:rPr>
+          <w:lang w:val="en-US"/>
+        </w:rPr>
+        <w:t>dname</w:t>
+      </w:r>
+      <w:proofErr w:type="spellEnd"/>
+      <w:r>
+        <w:rPr>
+          <w:lang w:val="en-US"/>
+        </w:rPr>
+        <w:t>=’SALES’;</w:t>
+      </w:r>
+    </w:p>
+    <w:p>
+      <w:pPr>
+        <w:pStyle w:val="ListParagraph"/>
+        <w:rPr>
+          <w:b/>
+          <w:bCs/>
+        </w:rPr>
+      </w:pPr>
+      <w:r>
+        <w:rPr>
+          <w:b/>
+          <w:bCs/>
+          <w:lang w:val="en-US"/>
+        </w:rPr>
+        <w:t xml:space="preserve">14. </w:t>
+      </w:r>
+      <w:r>
+        <w:rPr>
+          <w:b/>
+          <w:bCs/>
+        </w:rPr>
+        <w:t>WAQTD DEPT DETAILS OF THE EMPS WORKING IN CHICAGO AND HAVING CHAR 'E' IN THERE JOB.</w:t>
+      </w:r>
+    </w:p>
+    <w:p>
+      <w:pPr>
+        <w:pStyle w:val="ListParagraph"/>
+        <w:rPr>
+          <w:lang w:val="en-US"/>
+        </w:rPr>
+      </w:pPr>
+      <w:r>
+        <w:rPr>
+          <w:lang w:val="en-US"/>
+        </w:rPr>
+        <w:t xml:space="preserve">Select </w:t>
+      </w:r>
+      <w:r>
+        <w:rPr>
+          <w:lang w:val="en-US"/>
+        </w:rPr>
+        <w:t>d.</w:t>
+      </w:r>
+      <w:r>
+        <w:rPr>
+          <w:lang w:val="en-US"/>
+        </w:rPr>
+        <w:t xml:space="preserve">* </w:t>
+      </w:r>
+      <w:r>
+        <w:rPr>
+          <w:lang w:val="en-US"/>
+        </w:rPr>
+        <w:t xml:space="preserve">from emp </w:t>
+      </w:r>
+      <w:proofErr w:type="spellStart"/>
+      <w:r>
+        <w:rPr>
+          <w:lang w:val="en-US"/>
+        </w:rPr>
+        <w:t>e,dept</w:t>
+      </w:r>
+      <w:proofErr w:type="spellEnd"/>
+      <w:r>
+        <w:rPr>
+          <w:lang w:val="en-US"/>
+        </w:rPr>
+        <w:t xml:space="preserve"> d</w:t>
+      </w:r>
+    </w:p>
+    <w:p>
+      <w:pPr>
+        <w:pStyle w:val="ListParagraph"/>
+        <w:rPr>
+          <w:lang w:val="en-US"/>
+        </w:rPr>
+      </w:pPr>
+      <w:r>
+        <w:rPr>
+          <w:lang w:val="en-US"/>
+        </w:rPr>
+        <w:t xml:space="preserve">Where </w:t>
+      </w:r>
+      <w:proofErr w:type="spellStart"/>
+      <w:r>
+        <w:rPr>
+          <w:lang w:val="en-US"/>
+        </w:rPr>
+        <w:t>e.deptno</w:t>
+      </w:r>
+      <w:proofErr w:type="spellEnd"/>
+      <w:r>
+        <w:rPr>
+          <w:lang w:val="en-US"/>
+        </w:rPr>
+        <w:t>=</w:t>
+      </w:r>
+      <w:proofErr w:type="spellStart"/>
+      <w:r>
+        <w:rPr>
+          <w:lang w:val="en-US"/>
+        </w:rPr>
+        <w:t>d.deptno</w:t>
+      </w:r>
+      <w:proofErr w:type="spellEnd"/>
+      <w:r>
+        <w:rPr>
+          <w:lang w:val="en-US"/>
+        </w:rPr>
+        <w:t xml:space="preserve"> and loc=’CHICAGO’ and job like ‘%E%’;</w:t>
+      </w:r>
+    </w:p>
+    <w:p>
+      <w:pPr>
+        <w:pStyle w:val="ListParagraph"/>
+        <w:rPr>
+          <w:b/>
+          <w:bCs/>
+        </w:rPr>
+      </w:pPr>
+      <w:r>
+        <w:rPr>
+          <w:b/>
+          <w:bCs/>
+          <w:lang w:val="en-US"/>
+        </w:rPr>
+        <w:t xml:space="preserve">15. </w:t>
+      </w:r>
+      <w:r>
+        <w:rPr>
+          <w:b/>
+          <w:bCs/>
+        </w:rPr>
+        <w:t>WAQTD DNAME AND DEPTNO FOR ALL THE EMPS WHO'S EMPNO ARE (7839,7902) AND ARE WORKING IN LOC NEW YORK.</w:t>
+      </w:r>
+    </w:p>
+    <w:p>
+      <w:pPr>
+        <w:pStyle w:val="ListParagraph"/>
+      </w:pPr>
+      <w:r>
+        <w:t xml:space="preserve">Select </w:t>
+      </w:r>
+      <w:proofErr w:type="spellStart"/>
+      <w:r>
+        <w:t>dname,e.deptno</w:t>
+      </w:r>
+      <w:proofErr w:type="spellEnd"/>
+      <w:r>
+        <w:t xml:space="preserve"> from emp </w:t>
+      </w:r>
+      <w:proofErr w:type="spellStart"/>
+      <w:r>
+        <w:t>e,dept</w:t>
+      </w:r>
+      <w:proofErr w:type="spellEnd"/>
+      <w:r>
+        <w:t xml:space="preserve"> d</w:t>
+      </w:r>
+    </w:p>
+    <w:p>
+      <w:pPr>
+        <w:pStyle w:val="ListParagraph"/>
+        <w:rPr>
+          <w:lang w:val="en-US"/>
+        </w:rPr>
+      </w:pPr>
+      <w:r>
+        <w:t xml:space="preserve">Where </w:t>
+      </w:r>
+      <w:proofErr w:type="spellStart"/>
+      <w:r>
+        <w:t>e.deptno</w:t>
+      </w:r>
+      <w:proofErr w:type="spellEnd"/>
+      <w:r>
+        <w:t>=</w:t>
+      </w:r>
+      <w:proofErr w:type="spellStart"/>
+      <w:r>
+        <w:t>d.deptno</w:t>
+      </w:r>
+      <w:proofErr w:type="spellEnd"/>
+      <w:r>
+        <w:t xml:space="preserve"> and </w:t>
+      </w:r>
+      <w:proofErr w:type="spellStart"/>
+      <w:r>
+        <w:t>empno</w:t>
+      </w:r>
+      <w:proofErr w:type="spellEnd"/>
+      <w:r>
+        <w:t xml:space="preserve"> in (7839,7902) and loc in ‘NEW YORK’;</w:t>
+      </w:r>
     </w:p>
     <w:sectPr>
       <w:pgSz w:w="11906" w:h="16838"/>
@@ -14218,7 +14860,6 @@
   <w:style w:type="character" w:default="1" w:styleId="DefaultParagraphFont">
     <w:name w:val="Default Paragraph Font"/>
     <w:uiPriority w:val="1"/>
-    <w:semiHidden/>
     <w:unhideWhenUsed/>
   </w:style>
   <w:style w:type="table" w:default="1" w:styleId="TableNormal">

</xml_diff>